<commit_message>
sửa màn đăng nhập cho hệ thống, app mobile
</commit_message>
<xml_diff>
--- a/document/HUONG_DAN_BUILD_APK_VA_IOS.docx
+++ b/document/HUONG_DAN_BUILD_APK_VA_IOS.docx
@@ -1873,6 +1873,31 @@
       </w:pPr>
       <w:r>
         <w:t xml:space="preserve">👉 [EAS Builds Dashboard - ViOne Project](https://expo.dev/accounts/unicom-vibe-coding-team/projects/vione/builds)</w:t>
+      </w:r>
+    </w:p>
+    <w:p>
+      <w:pPr>
+        <w:pStyle w:val="ListParagraph"/>
+        <w:numPr>
+          <w:ilvl w:val="0"/>
+          <w:numId w:val="1"/>
+        </w:numPr>
+        <w:spacing w:after="30" w:before="30"/>
+      </w:pPr>
+      <w:r>
+        <w:rPr>
+          <w:b/>
+          <w:bCs/>
+        </w:rPr>
+        <w:t xml:space="preserve">Tải trực tiếp file `.IPA` ViOne Build 4 mới nhất:</w:t>
+      </w:r>
+    </w:p>
+    <w:p>
+      <w:pPr>
+        <w:spacing w:after="60" w:before="60"/>
+      </w:pPr>
+      <w:r>
+        <w:t xml:space="preserve">👉 [Download ViOne-Build-4.ipa](https://expo.dev/artifacts/eas/BaxacCwYnCr_yU9AIMjrcOtJC48VYaAG3jaJnoa3Wcc.ipa)</w:t>
       </w:r>
     </w:p>
     <w:p>

</xml_diff>